<commit_message>
Back up probability distribution Word files and pdfs
</commit_message>
<xml_diff>
--- a/docs/ib/04-Probability/4-11CW_trees_Test_IB-test-bank-questions-prob.docx
+++ b/docs/ib/04-Probability/4-11CW_trees_Test_IB-test-bank-questions-prob.docx
@@ -1198,8 +1198,18 @@
       <w:r>
         <w:rPr>
           <w:b/>
+          <w:bCs/>
         </w:rPr>
         <w:lastRenderedPageBreak/>
+        <w:t>4.12</w:t>
+      </w:r>
+      <w:r>
+        <w:t xml:space="preserve"> </w:t>
+      </w:r>
+      <w:r>
+        <w:rPr>
+          <w:b/>
+        </w:rPr>
         <w:t>Class</w:t>
       </w:r>
       <w:r>
@@ -1237,10 +1247,7 @@
         </w:rPr>
       </w:pPr>
       <w:r>
-        <w:t>1</w:t>
-      </w:r>
-      <w:r>
-        <w:t xml:space="preserve">. </w:t>
+        <w:t xml:space="preserve">1. </w:t>
       </w:r>
       <w:r>
         <w:t>A teacher has a box containing six type A calculators and four type B calculators.</w:t>
@@ -4018,8 +4025,23 @@
           <w:tab w:val="left" w:pos="8640"/>
           <w:tab w:val="left" w:pos="9360"/>
         </w:tabs>
-        <w:ind w:left="0" w:firstLine="0"/>
-      </w:pPr>
+        <w:rPr>
+          <w:b/>
+        </w:rPr>
+      </w:pPr>
+      <w:r>
+        <w:rPr>
+          <w:b/>
+        </w:rPr>
+        <w:lastRenderedPageBreak/>
+        <w:t xml:space="preserve">4.13 </w:t>
+      </w:r>
+      <w:r>
+        <w:rPr>
+          <w:b/>
+        </w:rPr>
+        <w:t>Classwork: Using trees to organize situations</w:t>
+      </w:r>
     </w:p>
     <w:p>
       <w:pPr>
@@ -4042,7 +4064,10 @@
         </w:tabs>
       </w:pPr>
       <w:r>
-        <w:t xml:space="preserve">5. </w:t>
+        <w:t>1</w:t>
+      </w:r>
+      <w:r>
+        <w:t xml:space="preserve">. </w:t>
       </w:r>
       <w:r>
         <w:t>Heinrik rolls two 6-sided dice at the same time. One die has three red sides and three black sides. The other die has the sides numbered from 1 to 6. By means of a tree diagram, table of outcomes or otherwise, answer each of the following questions.</w:t>
@@ -4532,7 +4557,10 @@
       </w:r>
       <w:r>
         <w:lastRenderedPageBreak/>
-        <w:t xml:space="preserve">4. </w:t>
+        <w:t>2</w:t>
+      </w:r>
+      <w:r>
+        <w:t xml:space="preserve">. </w:t>
       </w:r>
       <w:r>
         <w:t xml:space="preserve">Today Philip intends to go walking. The probability of good weather (G) is </w:t>
@@ -5208,27 +5236,30 @@
       <w:pPr>
         <w:pStyle w:val="question"/>
         <w:tabs>
-          <w:tab w:val="left" w:pos="567"/>
-          <w:tab w:val="left" w:pos="720"/>
-          <w:tab w:val="left" w:pos="1440"/>
-          <w:tab w:val="left" w:pos="2160"/>
-          <w:tab w:val="left" w:pos="2880"/>
-          <w:tab w:val="left" w:pos="3600"/>
-          <w:tab w:val="left" w:pos="4320"/>
-          <w:tab w:val="left" w:pos="5040"/>
-          <w:tab w:val="left" w:pos="5760"/>
-          <w:tab w:val="left" w:pos="6480"/>
-          <w:tab w:val="left" w:pos="7200"/>
-          <w:tab w:val="left" w:pos="7920"/>
-          <w:tab w:val="left" w:pos="8640"/>
-          <w:tab w:val="left" w:pos="9360"/>
-        </w:tabs>
+          <w:tab w:val="left" w:pos="270"/>
+          <w:tab w:val="left" w:pos="1440"/>
+          <w:tab w:val="left" w:pos="2160"/>
+          <w:tab w:val="left" w:pos="2880"/>
+          <w:tab w:val="left" w:pos="3600"/>
+          <w:tab w:val="left" w:pos="4320"/>
+          <w:tab w:val="left" w:pos="5040"/>
+          <w:tab w:val="left" w:pos="5760"/>
+          <w:tab w:val="left" w:pos="6480"/>
+          <w:tab w:val="left" w:pos="7200"/>
+          <w:tab w:val="left" w:pos="7920"/>
+          <w:tab w:val="left" w:pos="8640"/>
+          <w:tab w:val="left" w:pos="9360"/>
+        </w:tabs>
+        <w:ind w:left="270" w:hanging="270"/>
       </w:pPr>
       <w:r>
         <w:br w:type="page"/>
       </w:r>
       <w:r>
         <w:lastRenderedPageBreak/>
+        <w:t xml:space="preserve">3. </w:t>
+      </w:r>
+      <w:r>
         <w:t xml:space="preserve">There are two biscuit tins on a shelf. The </w:t>
       </w:r>
       <w:r>
@@ -5819,7 +5850,7 @@
       <w:pPr>
         <w:pStyle w:val="question"/>
         <w:tabs>
-          <w:tab w:val="left" w:pos="567"/>
+          <w:tab w:val="left" w:pos="0"/>
           <w:tab w:val="left" w:pos="720"/>
           <w:tab w:val="left" w:pos="1440"/>
           <w:tab w:val="left" w:pos="2160"/>
@@ -5834,12 +5865,17 @@
           <w:tab w:val="left" w:pos="8640"/>
           <w:tab w:val="left" w:pos="9360"/>
         </w:tabs>
+        <w:spacing w:after="240" w:line="360" w:lineRule="auto"/>
+        <w:ind w:left="270" w:right="450" w:hanging="270"/>
       </w:pPr>
       <w:r>
         <w:br w:type="page"/>
       </w:r>
       <w:r>
         <w:lastRenderedPageBreak/>
+        <w:t xml:space="preserve">4. </w:t>
+      </w:r>
+      <w:r>
         <w:t xml:space="preserve">The probability, </w:t>
       </w:r>
       <w:r>
@@ -6499,6 +6535,9 @@
       </w:r>
       <w:r>
         <w:lastRenderedPageBreak/>
+        <w:t xml:space="preserve">5. </w:t>
+      </w:r>
+      <w:r>
         <w:t>Sandra is attempting an exam question. She has to choose two correct statements from a list of five. Below is a tree diagram showing Sandra's possible choices. One of the probability values is missing.</w:t>
       </w:r>
     </w:p>
@@ -8615,7 +8654,7 @@
       <w:pStyle w:val="Header"/>
     </w:pPr>
     <w:r>
-      <w:t>6</w:t>
+      <w:t>12</w:t>
     </w:r>
     <w:r>
       <w:t xml:space="preserve"> February</w:t>

</xml_diff>